<commit_message>
front matter minor edits
</commit_message>
<xml_diff>
--- a/Front Matter/Template/4_Front-Matter_Template-v5.docx
+++ b/Front Matter/Template/4_Front-Matter_Template-v5.docx
@@ -1838,19 +1838,8 @@
           <w:szCs w:val="24"/>
           <w:lang w:val="en-US" w:eastAsia="zh-TW"/>
         </w:rPr>
-        <w:t>持有倫敦聖三一音樂學院作曲院士文憑、香港大學作曲哲學碩士及澳洲阿德萊德大學作曲哲學博士。學習期間重要的老師分別是葉純之教授、葉小鋼教授、陳慶恩博士、</w:t>
-      </w:r>
-      <w:proofErr w:type="gramStart"/>
-      <w:r>
-        <w:rPr>
-          <w:rFonts w:ascii="Noto Serif" w:eastAsia="Noto Serif SC" w:hAnsi="Noto Serif" w:cs="Noto Serif"/>
-          <w:sz w:val="24"/>
-          <w:szCs w:val="24"/>
-          <w:lang w:val="en-US" w:eastAsia="zh-TW"/>
-        </w:rPr>
-        <w:t>格美</w:t>
-      </w:r>
-      <w:proofErr w:type="gramEnd"/>
+        <w:t>持有倫敦聖三一音樂學院作曲院士文憑、香港大學作曲哲學碩士及澳洲阿德萊德大學作曲哲學博士。學習期間重要的老師分別是葉純之教授、葉小鋼教授、陳慶恩博士、格美</w:t>
+      </w:r>
       <w:r>
         <w:rPr>
           <w:rFonts w:ascii="Noto Serif" w:eastAsia="Noto Serif SC" w:hAnsi="Noto Serif" w:cs="Noto Serif"/>
@@ -1878,25 +1867,14 @@
         </w:rPr>
         <w:t xml:space="preserve">. </w:t>
       </w:r>
-      <w:proofErr w:type="gramStart"/>
-      <w:r>
-        <w:rPr>
-          <w:rFonts w:ascii="Noto Serif" w:eastAsia="Noto Serif SC" w:hAnsi="Noto Serif" w:cs="Noto Serif"/>
-          <w:sz w:val="24"/>
-          <w:szCs w:val="24"/>
-          <w:lang w:val="en-US" w:eastAsia="zh-TW"/>
-        </w:rPr>
-        <w:t>哥積克</w:t>
-      </w:r>
-      <w:proofErr w:type="gramEnd"/>
-      <w:r>
-        <w:rPr>
-          <w:rFonts w:ascii="Noto Serif" w:eastAsia="Noto Serif SC" w:hAnsi="Noto Serif" w:cs="Noto Serif"/>
-          <w:sz w:val="24"/>
-          <w:szCs w:val="24"/>
-          <w:lang w:val="en-US" w:eastAsia="zh-TW"/>
-        </w:rPr>
-        <w:t>博士。</w:t>
+      <w:r>
+        <w:rPr>
+          <w:rFonts w:ascii="Noto Serif" w:eastAsia="Noto Serif SC" w:hAnsi="Noto Serif" w:cs="Noto Serif"/>
+          <w:sz w:val="24"/>
+          <w:szCs w:val="24"/>
+          <w:lang w:val="en-US" w:eastAsia="zh-TW"/>
+        </w:rPr>
+        <w:t>哥積克博士。</w:t>
       </w:r>
     </w:p>
     <w:p>
@@ -1927,67 +1905,7 @@
           <w:szCs w:val="24"/>
           <w:lang w:val="en-US" w:eastAsia="zh-TW"/>
         </w:rPr>
-        <w:t>其作品曾在香港中樂團心樂集、香港中樂團</w:t>
-      </w:r>
-      <w:proofErr w:type="gramStart"/>
-      <w:r>
-        <w:rPr>
-          <w:rFonts w:ascii="Noto Serif" w:eastAsia="Noto Serif SC" w:hAnsi="Noto Serif" w:cs="Noto Serif"/>
-          <w:sz w:val="24"/>
-          <w:szCs w:val="24"/>
-          <w:lang w:val="en-US" w:eastAsia="zh-TW"/>
-        </w:rPr>
-        <w:t>香江華采</w:t>
-      </w:r>
-      <w:proofErr w:type="gramEnd"/>
-      <w:r>
-        <w:rPr>
-          <w:rFonts w:ascii="Noto Serif" w:eastAsia="Noto Serif SC" w:hAnsi="Noto Serif" w:cs="Noto Serif"/>
-          <w:sz w:val="24"/>
-          <w:szCs w:val="24"/>
-          <w:lang w:val="en-US" w:eastAsia="zh-TW"/>
-        </w:rPr>
-        <w:t>、香港音樂新文化、北京現代音樂節、國際現代音樂協會世界音樂日、聯合國教科文組織之國際作曲家論壇、中國交響樂世紀回顧暨</w:t>
-      </w:r>
-      <w:proofErr w:type="gramStart"/>
-      <w:r>
-        <w:rPr>
-          <w:rFonts w:ascii="Noto Serif" w:eastAsia="Noto Serif SC" w:hAnsi="Noto Serif" w:cs="Noto Serif"/>
-          <w:sz w:val="24"/>
-          <w:szCs w:val="24"/>
-          <w:lang w:val="en-US" w:eastAsia="zh-TW"/>
-        </w:rPr>
-        <w:t>第二屆中國交</w:t>
-      </w:r>
-      <w:proofErr w:type="gramEnd"/>
-      <w:r>
-        <w:rPr>
-          <w:rFonts w:ascii="Noto Serif" w:eastAsia="Noto Serif SC" w:hAnsi="Noto Serif" w:cs="Noto Serif"/>
-          <w:sz w:val="24"/>
-          <w:szCs w:val="24"/>
-          <w:lang w:val="en-US" w:eastAsia="zh-TW"/>
-        </w:rPr>
-        <w:t>響音樂季－河北展</w:t>
-      </w:r>
-      <w:proofErr w:type="gramStart"/>
-      <w:r>
-        <w:rPr>
-          <w:rFonts w:ascii="Noto Serif" w:eastAsia="Noto Serif SC" w:hAnsi="Noto Serif" w:cs="Noto Serif"/>
-          <w:sz w:val="24"/>
-          <w:szCs w:val="24"/>
-          <w:lang w:val="en-US" w:eastAsia="zh-TW"/>
-        </w:rPr>
-        <w:t>演周、</w:t>
-      </w:r>
-      <w:proofErr w:type="gramEnd"/>
-      <w:r>
-        <w:rPr>
-          <w:rFonts w:ascii="Noto Serif" w:eastAsia="Noto Serif SC" w:hAnsi="Noto Serif" w:cs="Noto Serif"/>
-          <w:sz w:val="24"/>
-          <w:szCs w:val="24"/>
-          <w:lang w:val="en-US" w:eastAsia="zh-TW"/>
-        </w:rPr>
-        <w:t>新加坡國際華樂作曲大賽得獎作品音樂會及亞洲作曲家聯盟大會暨亞太音樂節、臺灣小巨人絲竹樂團室內樂系列、中國之聲第二屆作曲比賽獲獎作品音樂會、俄羅斯索契音樂節、澳門純音雅詠合唱團週年音樂會及澳門藝術節等中發表。</w:t>
+        <w:t>其作品曾在香港中樂團心樂集、香港中樂團香江華采、香港音樂新文化、北京現代音樂節、國際現代音樂協會世界音樂日、聯合國教科文組織之國際作曲家論壇、中國交響樂世紀回顧暨第二屆中國交響音樂季－河北展演周、新加坡國際華樂作曲大賽得獎作品音樂會及亞洲作曲家聯盟大會暨亞太音樂節、臺灣小巨人絲竹樂團室內樂系列、中國之聲第二屆作曲比賽獲獎作品音樂會、俄羅斯索契音樂節、澳門純音雅詠合唱團週年音樂會及澳門藝術節等中發表。</w:t>
       </w:r>
     </w:p>
     <w:p>
@@ -2036,27 +1954,7 @@
           <w:szCs w:val="24"/>
           <w:lang w:val="en-US" w:eastAsia="zh-TW"/>
         </w:rPr>
-        <w:t>年</w:t>
-      </w:r>
-      <w:proofErr w:type="gramStart"/>
-      <w:r>
-        <w:rPr>
-          <w:rFonts w:ascii="Noto Serif" w:eastAsia="Noto Serif SC" w:hAnsi="Noto Serif" w:cs="Noto Serif"/>
-          <w:sz w:val="24"/>
-          <w:szCs w:val="24"/>
-          <w:lang w:val="en-US" w:eastAsia="zh-TW"/>
-        </w:rPr>
-        <w:t>后</w:t>
-      </w:r>
-      <w:proofErr w:type="gramEnd"/>
-      <w:r>
-        <w:rPr>
-          <w:rFonts w:ascii="Noto Serif" w:eastAsia="Noto Serif SC" w:hAnsi="Noto Serif" w:cs="Noto Serif"/>
-          <w:sz w:val="24"/>
-          <w:szCs w:val="24"/>
-          <w:lang w:val="en-US" w:eastAsia="zh-TW"/>
-        </w:rPr>
-        <w:t>移居澳門，現為澳門理工大學音樂課程副教授。</w:t>
+        <w:t>年后移居澳門，現為澳門理工大學音樂課程副教授。</w:t>
       </w:r>
       <w:r>
         <w:rPr>
@@ -2263,47 +2161,7 @@
           <w:szCs w:val="24"/>
           <w:lang w:val="en-US"/>
         </w:rPr>
-        <w:t>Raymond Mok obtained the FTCL in Music Composition from the Trinity College, a Master of Philosophy in Music Composition from the University of Hong Kong and Doctor of Philosophy in Music Composition from the University of Adelaide. A number of teachers were influential to his studies, including Prof. Ip Shun-chi, Prof. Ye Xiao-gang, Dr. Chan Hing-</w:t>
-      </w:r>
-      <w:proofErr w:type="spellStart"/>
-      <w:r>
-        <w:rPr>
-          <w:rFonts w:ascii="Noto Serif" w:eastAsia="Noto Serif SC" w:hAnsi="Noto Serif" w:cs="Noto Serif"/>
-          <w:sz w:val="24"/>
-          <w:szCs w:val="24"/>
-          <w:lang w:val="en-US"/>
-        </w:rPr>
-        <w:t>yan</w:t>
-      </w:r>
-      <w:proofErr w:type="spellEnd"/>
-      <w:r>
-        <w:rPr>
-          <w:rFonts w:ascii="Noto Serif" w:eastAsia="Noto Serif SC" w:hAnsi="Noto Serif" w:cs="Noto Serif"/>
-          <w:sz w:val="24"/>
-          <w:szCs w:val="24"/>
-          <w:lang w:val="en-US"/>
-        </w:rPr>
-        <w:t xml:space="preserve">, Dr. Graeme Koehne and Dr. Kimi </w:t>
-      </w:r>
-      <w:proofErr w:type="spellStart"/>
-      <w:r>
-        <w:rPr>
-          <w:rFonts w:ascii="Noto Serif" w:eastAsia="Noto Serif SC" w:hAnsi="Noto Serif" w:cs="Noto Serif"/>
-          <w:sz w:val="24"/>
-          <w:szCs w:val="24"/>
-          <w:lang w:val="en-US"/>
-        </w:rPr>
-        <w:t>Coaldrake</w:t>
-      </w:r>
-      <w:proofErr w:type="spellEnd"/>
-      <w:r>
-        <w:rPr>
-          <w:rFonts w:ascii="Noto Serif" w:eastAsia="Noto Serif SC" w:hAnsi="Noto Serif" w:cs="Noto Serif"/>
-          <w:sz w:val="24"/>
-          <w:szCs w:val="24"/>
-          <w:lang w:val="en-US"/>
-        </w:rPr>
-        <w:t>.</w:t>
+        <w:t>Raymond Mok obtained the FTCL in Music Composition from the Trinity College, a Master of Philosophy in Music Composition from the University of Hong Kong and Doctor of Philosophy in Music Composition from the University of Adelaide. A number of teachers were influential to his studies, including Prof. Ip Shun-chi, Prof. Ye Xiao-gang, Dr. Chan Hing-yan, Dr. Graeme Koehne and Dr. Kimi Coaldrake.</w:t>
       </w:r>
     </w:p>
     <w:p>
@@ -2377,7 +2235,6 @@
         </w:rPr>
         <w:t xml:space="preserve"> </w:t>
       </w:r>
-      <w:proofErr w:type="spellStart"/>
       <w:r>
         <w:rPr>
           <w:rFonts w:ascii="Noto Serif" w:eastAsia="Noto Serif SC" w:hAnsi="Noto Serif" w:cs="Noto Serif"/>
@@ -2388,7 +2245,6 @@
         </w:rPr>
         <w:t>Musicarama</w:t>
       </w:r>
-      <w:proofErr w:type="spellEnd"/>
       <w:r>
         <w:rPr>
           <w:rFonts w:ascii="Noto Serif" w:eastAsia="Noto Serif SC" w:hAnsi="Noto Serif" w:cs="Noto Serif"/>
@@ -2724,87 +2580,7 @@
           <w:szCs w:val="24"/>
           <w:lang w:val="en-US" w:eastAsia="zh-TW"/>
         </w:rPr>
-        <w:t>此曲為香港中樂團委約作品，為介紹香港圓玄學院而創作。圓玄學院是香港的宗教聖地，寺院的思想內容廣博且形式</w:t>
-      </w:r>
-      <w:proofErr w:type="gramStart"/>
-      <w:r>
-        <w:rPr>
-          <w:rFonts w:ascii="Noto Serif" w:eastAsia="Noto Serif SC" w:hAnsi="Noto Serif" w:cs="Noto Serif"/>
-          <w:sz w:val="24"/>
-          <w:szCs w:val="24"/>
-          <w:lang w:val="en-US" w:eastAsia="zh-TW"/>
-        </w:rPr>
-        <w:t>多樣，兼容儒</w:t>
-      </w:r>
-      <w:proofErr w:type="gramEnd"/>
-      <w:r>
-        <w:rPr>
-          <w:rFonts w:ascii="Noto Serif" w:eastAsia="Noto Serif SC" w:hAnsi="Noto Serif" w:cs="Noto Serif"/>
-          <w:sz w:val="24"/>
-          <w:szCs w:val="24"/>
-          <w:lang w:val="en-US" w:eastAsia="zh-TW"/>
-        </w:rPr>
-        <w:t>、道、佛三教。寺院包羅萬象的</w:t>
-      </w:r>
-      <w:proofErr w:type="gramStart"/>
-      <w:r>
-        <w:rPr>
-          <w:rFonts w:ascii="Noto Serif" w:eastAsia="Noto Serif SC" w:hAnsi="Noto Serif" w:cs="Noto Serif"/>
-          <w:sz w:val="24"/>
-          <w:szCs w:val="24"/>
-          <w:lang w:val="en-US" w:eastAsia="zh-TW"/>
-        </w:rPr>
-        <w:t>研</w:t>
-      </w:r>
-      <w:proofErr w:type="gramEnd"/>
-      <w:r>
-        <w:rPr>
-          <w:rFonts w:ascii="Noto Serif" w:eastAsia="Noto Serif SC" w:hAnsi="Noto Serif" w:cs="Noto Serif"/>
-          <w:sz w:val="24"/>
-          <w:szCs w:val="24"/>
-          <w:lang w:val="en-US" w:eastAsia="zh-TW"/>
-        </w:rPr>
-        <w:t>修內容使我在創作此樂曲時能自如地選擇古今中外的音樂素材，跳脫一種宗教的思維定式，</w:t>
-      </w:r>
-      <w:proofErr w:type="gramStart"/>
-      <w:r>
-        <w:rPr>
-          <w:rFonts w:ascii="Noto Serif" w:eastAsia="Noto Serif SC" w:hAnsi="Noto Serif" w:cs="Noto Serif"/>
-          <w:sz w:val="24"/>
-          <w:szCs w:val="24"/>
-          <w:lang w:val="en-US" w:eastAsia="zh-TW"/>
-        </w:rPr>
-        <w:t>透過拼</w:t>
-      </w:r>
-      <w:proofErr w:type="gramEnd"/>
-      <w:r>
-        <w:rPr>
-          <w:rFonts w:ascii="Noto Serif" w:eastAsia="Noto Serif SC" w:hAnsi="Noto Serif" w:cs="Noto Serif"/>
-          <w:sz w:val="24"/>
-          <w:szCs w:val="24"/>
-          <w:lang w:val="en-US" w:eastAsia="zh-TW"/>
-        </w:rPr>
-        <w:t>貼和</w:t>
-      </w:r>
-      <w:proofErr w:type="gramStart"/>
-      <w:r>
-        <w:rPr>
-          <w:rFonts w:ascii="Noto Serif" w:eastAsia="Noto Serif SC" w:hAnsi="Noto Serif" w:cs="Noto Serif"/>
-          <w:sz w:val="24"/>
-          <w:szCs w:val="24"/>
-          <w:lang w:val="en-US" w:eastAsia="zh-TW"/>
-        </w:rPr>
-        <w:t>並</w:t>
-      </w:r>
-      <w:proofErr w:type="gramEnd"/>
-      <w:r>
-        <w:rPr>
-          <w:rFonts w:ascii="Noto Serif" w:eastAsia="Noto Serif SC" w:hAnsi="Noto Serif" w:cs="Noto Serif"/>
-          <w:sz w:val="24"/>
-          <w:szCs w:val="24"/>
-          <w:lang w:val="en-US" w:eastAsia="zh-TW"/>
-        </w:rPr>
-        <w:t>置的手法，把各種素材加以提煉和發展。</w:t>
+        <w:t>此曲為香港中樂團委約作品，為介紹香港圓玄學院而創作。圓玄學院是香港的宗教聖地，寺院的思想內容廣博且形式多樣，兼容儒、道、佛三教。寺院包羅萬象的研修內容使我在創作此樂曲時能自如地選擇古今中外的音樂素材，跳脫一種宗教的思維定式，透過拼貼和並置的手法，把各種素材加以提煉和發展。</w:t>
       </w:r>
     </w:p>
     <w:p>
@@ -2898,7 +2674,6 @@
         </w:rPr>
         <w:t>內部音樂素材的融合以及與外圍音樂素材的碰撞最能彰顯到樂曲在色彩上的混合與對比；而在樂曲的最後，不同的音樂素材在完成了自身的起承轉合之後結束演奏，樂曲的素材慢慢遞減，直到最後一種素材慢慢消逝</w:t>
       </w:r>
-      <w:proofErr w:type="gramStart"/>
       <w:r>
         <w:rPr>
           <w:rFonts w:ascii="Noto Serif" w:eastAsia="Noto Serif SC" w:hAnsi="Noto Serif" w:cs="Noto Serif"/>
@@ -2908,7 +2683,6 @@
         </w:rPr>
         <w:t>——</w:t>
       </w:r>
-      <w:proofErr w:type="gramEnd"/>
       <w:r>
         <w:rPr>
           <w:rFonts w:ascii="Noto Serif" w:eastAsia="Noto Serif SC" w:hAnsi="Noto Serif" w:cs="Noto Serif"/>
@@ -2964,27 +2738,7 @@
           <w:szCs w:val="24"/>
           <w:lang w:val="en-US"/>
         </w:rPr>
-        <w:t xml:space="preserve">The composition depicts The Yuen </w:t>
-      </w:r>
-      <w:proofErr w:type="spellStart"/>
-      <w:r>
-        <w:rPr>
-          <w:rFonts w:ascii="Noto Serif" w:eastAsia="Noto Serif SC" w:hAnsi="Noto Serif" w:cs="Noto Serif"/>
-          <w:sz w:val="24"/>
-          <w:szCs w:val="24"/>
-          <w:lang w:val="en-US"/>
-        </w:rPr>
-        <w:t>Yuen</w:t>
-      </w:r>
-      <w:proofErr w:type="spellEnd"/>
-      <w:r>
-        <w:rPr>
-          <w:rFonts w:ascii="Noto Serif" w:eastAsia="Noto Serif SC" w:hAnsi="Noto Serif" w:cs="Noto Serif"/>
-          <w:sz w:val="24"/>
-          <w:szCs w:val="24"/>
-          <w:lang w:val="en-US"/>
-        </w:rPr>
-        <w:t xml:space="preserve"> Institute which is a place of learning Taoism and religious retreat. But it is distinguished by an integrative, all-embracing intellectualism, with its pantheistic approach to religion, including Confucianism. Its non-exclusive stance has become an inspiring perspective for me in composing this work. I felt I was uninhibited by subject matter, style and cultural background and was free to choose whatever I wanted in the treasury of music of East and West, to remix and juxtapose them for a collage that sublimates and develops into something new.</w:t>
+        <w:t>The composition depicts The Yuen Yuen Institute which is a place of learning Taoism and religious retreat. But it is distinguished by an integrative, all-embracing intellectualism, with its pantheistic approach to religion, including Confucianism. Its non-exclusive stance has become an inspiring perspective for me in composing this work. I felt I was uninhibited by subject matter, style and cultural background and was free to choose whatever I wanted in the treasury of music of East and West, to remix and juxtapose them for a collage that sublimates and develops into something new.</w:t>
       </w:r>
     </w:p>
     <w:p>
@@ -3124,6 +2878,15 @@
           <w:szCs w:val="24"/>
           <w:lang w:val="en-US"/>
         </w:rPr>
+        <w:t xml:space="preserve">1 </w:t>
+      </w:r>
+      <w:r>
+        <w:rPr>
+          <w:rFonts w:ascii="Noto Serif" w:eastAsia="Noto Serif SC" w:hAnsi="Noto Serif" w:cs="Noto Serif"/>
+          <w:sz w:val="24"/>
+          <w:szCs w:val="24"/>
+          <w:lang w:val="en-US"/>
+        </w:rPr>
         <w:t>梆笛</w:t>
       </w:r>
       <w:r>
@@ -3135,7 +2898,15 @@
         </w:rPr>
         <w:t xml:space="preserve"> </w:t>
       </w:r>
-      <w:proofErr w:type="spellStart"/>
+      <w:r>
+        <w:rPr>
+          <w:rFonts w:ascii="Noto Serif" w:eastAsia="Noto Serif SC" w:hAnsi="Noto Serif" w:cs="Noto Serif"/>
+          <w:sz w:val="24"/>
+          <w:szCs w:val="24"/>
+          <w:lang w:val="en-US"/>
+        </w:rPr>
+        <w:t xml:space="preserve">1 </w:t>
+      </w:r>
       <w:r>
         <w:rPr>
           <w:rFonts w:ascii="Noto Serif" w:eastAsia="Noto Serif SC" w:hAnsi="Noto Serif" w:cs="Noto Serif"/>
@@ -3145,17 +2916,25 @@
         </w:rPr>
         <w:t>Bangdi</w:t>
       </w:r>
-      <w:proofErr w:type="spellEnd"/>
-    </w:p>
-    <w:p>
-      <w:pPr>
-        <w:rPr>
-          <w:rFonts w:ascii="Noto Serif" w:eastAsia="Noto Serif SC" w:hAnsi="Noto Serif" w:cs="Noto Serif"/>
-          <w:sz w:val="24"/>
-          <w:szCs w:val="24"/>
-          <w:lang w:val="en-US"/>
-        </w:rPr>
-      </w:pPr>
+    </w:p>
+    <w:p>
+      <w:pPr>
+        <w:rPr>
+          <w:rFonts w:ascii="Noto Serif" w:eastAsia="Noto Serif SC" w:hAnsi="Noto Serif" w:cs="Noto Serif"/>
+          <w:sz w:val="24"/>
+          <w:szCs w:val="24"/>
+          <w:lang w:val="en-US"/>
+        </w:rPr>
+      </w:pPr>
+      <w:r>
+        <w:rPr>
+          <w:rFonts w:ascii="Noto Serif" w:eastAsia="Noto Serif SC" w:hAnsi="Noto Serif" w:cs="Noto Serif"/>
+          <w:sz w:val="24"/>
+          <w:szCs w:val="24"/>
+          <w:lang w:val="en-US"/>
+        </w:rPr>
+        <w:t xml:space="preserve">1 </w:t>
+      </w:r>
       <w:r>
         <w:rPr>
           <w:rFonts w:ascii="Noto Serif" w:eastAsia="Noto Serif SC" w:hAnsi="Noto Serif" w:cs="Noto Serif"/>
@@ -3174,7 +2953,15 @@
         </w:rPr>
         <w:t xml:space="preserve"> </w:t>
       </w:r>
-      <w:proofErr w:type="spellStart"/>
+      <w:r>
+        <w:rPr>
+          <w:rFonts w:ascii="Noto Serif" w:eastAsia="Noto Serif SC" w:hAnsi="Noto Serif" w:cs="Noto Serif"/>
+          <w:sz w:val="24"/>
+          <w:szCs w:val="24"/>
+          <w:lang w:val="en-US"/>
+        </w:rPr>
+        <w:t xml:space="preserve">1 </w:t>
+      </w:r>
       <w:r>
         <w:rPr>
           <w:rFonts w:ascii="Noto Serif" w:eastAsia="Noto Serif SC" w:hAnsi="Noto Serif" w:cs="Noto Serif"/>
@@ -3184,17 +2971,25 @@
         </w:rPr>
         <w:t>Qudi</w:t>
       </w:r>
-      <w:proofErr w:type="spellEnd"/>
-    </w:p>
-    <w:p>
-      <w:pPr>
-        <w:rPr>
-          <w:rFonts w:ascii="Noto Serif" w:eastAsia="Noto Serif SC" w:hAnsi="Noto Serif" w:cs="Noto Serif"/>
-          <w:sz w:val="24"/>
-          <w:szCs w:val="24"/>
-          <w:lang w:val="en-US"/>
-        </w:rPr>
-      </w:pPr>
+    </w:p>
+    <w:p>
+      <w:pPr>
+        <w:rPr>
+          <w:rFonts w:ascii="Noto Serif" w:eastAsia="Noto Serif SC" w:hAnsi="Noto Serif" w:cs="Noto Serif"/>
+          <w:sz w:val="24"/>
+          <w:szCs w:val="24"/>
+          <w:lang w:val="en-US"/>
+        </w:rPr>
+      </w:pPr>
+      <w:r>
+        <w:rPr>
+          <w:rFonts w:ascii="Noto Serif" w:eastAsia="Noto Serif SC" w:hAnsi="Noto Serif" w:cs="Noto Serif"/>
+          <w:sz w:val="24"/>
+          <w:szCs w:val="24"/>
+          <w:lang w:val="en-GB"/>
+        </w:rPr>
+        <w:t xml:space="preserve">1 </w:t>
+      </w:r>
       <w:r>
         <w:rPr>
           <w:rFonts w:ascii="Noto Serif" w:eastAsia="Noto Serif SC" w:hAnsi="Noto Serif" w:cs="Noto Serif"/>
@@ -3212,7 +3007,15 @@
         </w:rPr>
         <w:t xml:space="preserve"> </w:t>
       </w:r>
-      <w:proofErr w:type="spellStart"/>
+      <w:r>
+        <w:rPr>
+          <w:rFonts w:ascii="Noto Serif" w:eastAsia="Noto Serif SC" w:hAnsi="Noto Serif" w:cs="Noto Serif"/>
+          <w:sz w:val="24"/>
+          <w:szCs w:val="24"/>
+          <w:lang w:val="en-US"/>
+        </w:rPr>
+        <w:t xml:space="preserve">1 </w:t>
+      </w:r>
       <w:r>
         <w:rPr>
           <w:rFonts w:ascii="Noto Serif" w:eastAsia="Noto Serif SC" w:hAnsi="Noto Serif" w:cs="Noto Serif"/>
@@ -3222,27 +3025,35 @@
         </w:rPr>
         <w:t>Xindi</w:t>
       </w:r>
-      <w:proofErr w:type="spellEnd"/>
-    </w:p>
-    <w:p>
-      <w:pPr>
-        <w:rPr>
-          <w:rFonts w:ascii="Noto Serif" w:eastAsia="Noto Serif SC" w:hAnsi="Noto Serif" w:cs="Noto Serif"/>
-          <w:sz w:val="24"/>
-          <w:szCs w:val="24"/>
-          <w:lang w:val="en-US"/>
-        </w:rPr>
-      </w:pPr>
-    </w:p>
-    <w:p>
-      <w:pPr>
-        <w:rPr>
-          <w:rFonts w:ascii="Noto Serif" w:eastAsia="Noto Serif SC" w:hAnsi="Noto Serif" w:cs="Noto Serif"/>
-          <w:sz w:val="24"/>
-          <w:szCs w:val="24"/>
-          <w:lang w:val="en-US"/>
-        </w:rPr>
-      </w:pPr>
+    </w:p>
+    <w:p>
+      <w:pPr>
+        <w:rPr>
+          <w:rFonts w:ascii="Noto Serif" w:eastAsia="Noto Serif SC" w:hAnsi="Noto Serif" w:cs="Noto Serif"/>
+          <w:sz w:val="24"/>
+          <w:szCs w:val="24"/>
+          <w:lang w:val="en-US"/>
+        </w:rPr>
+      </w:pPr>
+    </w:p>
+    <w:p>
+      <w:pPr>
+        <w:rPr>
+          <w:rFonts w:ascii="Noto Serif" w:eastAsia="Noto Serif SC" w:hAnsi="Noto Serif" w:cs="Noto Serif"/>
+          <w:sz w:val="24"/>
+          <w:szCs w:val="24"/>
+          <w:lang w:val="en-US"/>
+        </w:rPr>
+      </w:pPr>
+      <w:r>
+        <w:rPr>
+          <w:rFonts w:ascii="Noto Serif" w:eastAsia="Noto Serif SC" w:hAnsi="Noto Serif" w:cs="Noto Serif"/>
+          <w:sz w:val="24"/>
+          <w:szCs w:val="24"/>
+          <w:lang w:val="en-US"/>
+        </w:rPr>
+        <w:t xml:space="preserve">1 </w:t>
+      </w:r>
       <w:r>
         <w:rPr>
           <w:rFonts w:ascii="Noto Serif" w:eastAsia="Noto Serif SC" w:hAnsi="Noto Serif" w:cs="Noto Serif"/>
@@ -3259,7 +3070,25 @@
           <w:szCs w:val="24"/>
           <w:lang w:val="en-US"/>
         </w:rPr>
-        <w:t xml:space="preserve"> Sheng</w:t>
+        <w:t xml:space="preserve"> </w:t>
+      </w:r>
+      <w:r>
+        <w:rPr>
+          <w:rFonts w:ascii="Noto Serif" w:eastAsia="Noto Serif SC" w:hAnsi="Noto Serif" w:cs="Noto Serif"/>
+          <w:sz w:val="24"/>
+          <w:szCs w:val="24"/>
+          <w:lang w:val="en-US"/>
+        </w:rPr>
+        <w:t xml:space="preserve">1 </w:t>
+      </w:r>
+      <w:r>
+        <w:rPr>
+          <w:rFonts w:ascii="Noto Serif" w:eastAsia="Noto Serif SC" w:hAnsi="Noto Serif" w:cs="Noto Serif"/>
+          <w:sz w:val="24"/>
+          <w:szCs w:val="24"/>
+          <w:lang w:val="en-US"/>
+        </w:rPr>
+        <w:t>Sheng</w:t>
       </w:r>
     </w:p>
     <w:p>
@@ -3324,19 +3153,101 @@
           <w:szCs w:val="24"/>
           <w:lang w:val="en-US"/>
         </w:rPr>
+        <w:t xml:space="preserve"> Gaoyin Suona</w:t>
+      </w:r>
+    </w:p>
+    <w:p>
+      <w:pPr>
+        <w:rPr>
+          <w:rFonts w:ascii="Noto Serif" w:eastAsia="Noto Serif SC" w:hAnsi="Noto Serif" w:cs="Noto Serif"/>
+          <w:sz w:val="24"/>
+          <w:szCs w:val="24"/>
+          <w:lang w:val="en-US"/>
+        </w:rPr>
+      </w:pPr>
+      <w:r>
+        <w:rPr>
+          <w:rFonts w:ascii="Noto Serif" w:eastAsia="Noto Serif SC" w:hAnsi="Noto Serif" w:cs="Noto Serif"/>
+          <w:sz w:val="24"/>
+          <w:szCs w:val="24"/>
+          <w:lang w:val="en-US"/>
+        </w:rPr>
+        <w:t xml:space="preserve">1 </w:t>
+      </w:r>
+      <w:r>
+        <w:rPr>
+          <w:rFonts w:ascii="Noto Serif" w:eastAsia="Noto Serif SC" w:hAnsi="Noto Serif" w:cs="Noto Serif"/>
+          <w:sz w:val="24"/>
+          <w:szCs w:val="24"/>
+          <w:lang w:val="en-US"/>
+        </w:rPr>
+        <w:t>中音唢呐</w:t>
+      </w:r>
+      <w:r>
+        <w:rPr>
+          <w:rFonts w:ascii="Noto Serif" w:eastAsia="Noto Serif SC" w:hAnsi="Noto Serif" w:cs="Noto Serif"/>
+          <w:sz w:val="24"/>
+          <w:szCs w:val="24"/>
+          <w:lang w:val="en-US"/>
+        </w:rPr>
         <w:t xml:space="preserve"> </w:t>
       </w:r>
-      <w:proofErr w:type="spellStart"/>
-      <w:r>
-        <w:rPr>
-          <w:rFonts w:ascii="Noto Serif" w:eastAsia="Noto Serif SC" w:hAnsi="Noto Serif" w:cs="Noto Serif"/>
-          <w:sz w:val="24"/>
-          <w:szCs w:val="24"/>
-          <w:lang w:val="en-US"/>
-        </w:rPr>
-        <w:t>Gaoyin</w:t>
-      </w:r>
-      <w:proofErr w:type="spellEnd"/>
+      <w:r>
+        <w:rPr>
+          <w:rFonts w:ascii="Noto Serif" w:eastAsia="Noto Serif SC" w:hAnsi="Noto Serif" w:cs="Noto Serif"/>
+          <w:sz w:val="24"/>
+          <w:szCs w:val="24"/>
+          <w:lang w:val="en-US"/>
+        </w:rPr>
+        <w:t xml:space="preserve">1 </w:t>
+      </w:r>
+      <w:r>
+        <w:rPr>
+          <w:rFonts w:ascii="Noto Serif" w:eastAsia="Noto Serif SC" w:hAnsi="Noto Serif" w:cs="Noto Serif"/>
+          <w:sz w:val="24"/>
+          <w:szCs w:val="24"/>
+          <w:lang w:val="en-US"/>
+        </w:rPr>
+        <w:t>Zhongyin Suona</w:t>
+      </w:r>
+    </w:p>
+    <w:p>
+      <w:pPr>
+        <w:rPr>
+          <w:rFonts w:ascii="Noto Serif" w:eastAsia="Noto Serif SC" w:hAnsi="Noto Serif" w:cs="Noto Serif"/>
+          <w:sz w:val="24"/>
+          <w:szCs w:val="24"/>
+          <w:lang w:val="en-US"/>
+        </w:rPr>
+      </w:pPr>
+    </w:p>
+    <w:p>
+      <w:pPr>
+        <w:rPr>
+          <w:rFonts w:ascii="Noto Serif" w:eastAsia="Noto Serif SC" w:hAnsi="Noto Serif" w:cs="Noto Serif"/>
+          <w:sz w:val="24"/>
+          <w:szCs w:val="24"/>
+          <w:lang w:val="en-US"/>
+        </w:rPr>
+      </w:pPr>
+      <w:r>
+        <w:rPr>
+          <w:rFonts w:ascii="Noto Serif" w:eastAsia="Noto Serif SC" w:hAnsi="Noto Serif" w:cs="Noto Serif"/>
+          <w:sz w:val="24"/>
+          <w:szCs w:val="24"/>
+          <w:lang w:val="en-US"/>
+        </w:rPr>
+        <w:t xml:space="preserve">1 </w:t>
+      </w:r>
+      <w:r>
+        <w:rPr>
+          <w:rFonts w:ascii="Noto Serif" w:eastAsia="Noto Serif SC" w:hAnsi="Noto Serif" w:cs="Noto Serif"/>
+          <w:sz w:val="24"/>
+          <w:szCs w:val="24"/>
+          <w:lang w:val="en-US"/>
+        </w:rPr>
+        <w:t>扬琴</w:t>
+      </w:r>
       <w:r>
         <w:rPr>
           <w:rFonts w:ascii="Noto Serif" w:eastAsia="Noto Serif SC" w:hAnsi="Noto Serif" w:cs="Noto Serif"/>
@@ -3346,35 +3257,51 @@
         </w:rPr>
         <w:t xml:space="preserve"> </w:t>
       </w:r>
-      <w:proofErr w:type="spellStart"/>
-      <w:r>
-        <w:rPr>
-          <w:rFonts w:ascii="Noto Serif" w:eastAsia="Noto Serif SC" w:hAnsi="Noto Serif" w:cs="Noto Serif"/>
-          <w:sz w:val="24"/>
-          <w:szCs w:val="24"/>
-          <w:lang w:val="en-US"/>
-        </w:rPr>
-        <w:t>Suona</w:t>
-      </w:r>
-      <w:proofErr w:type="spellEnd"/>
-    </w:p>
-    <w:p>
-      <w:pPr>
-        <w:rPr>
-          <w:rFonts w:ascii="Noto Serif" w:eastAsia="Noto Serif SC" w:hAnsi="Noto Serif" w:cs="Noto Serif"/>
-          <w:sz w:val="24"/>
-          <w:szCs w:val="24"/>
-          <w:lang w:val="en-US"/>
-        </w:rPr>
-      </w:pPr>
-      <w:r>
-        <w:rPr>
-          <w:rFonts w:ascii="Noto Serif" w:eastAsia="Noto Serif SC" w:hAnsi="Noto Serif" w:cs="Noto Serif"/>
-          <w:sz w:val="24"/>
-          <w:szCs w:val="24"/>
-          <w:lang w:val="en-US"/>
-        </w:rPr>
-        <w:t>中音唢呐</w:t>
+      <w:r>
+        <w:rPr>
+          <w:rFonts w:ascii="Noto Serif" w:eastAsia="Noto Serif SC" w:hAnsi="Noto Serif" w:cs="Noto Serif"/>
+          <w:sz w:val="24"/>
+          <w:szCs w:val="24"/>
+          <w:lang w:val="en-US"/>
+        </w:rPr>
+        <w:t xml:space="preserve">1 </w:t>
+      </w:r>
+      <w:r>
+        <w:rPr>
+          <w:rFonts w:ascii="Noto Serif" w:eastAsia="Noto Serif SC" w:hAnsi="Noto Serif" w:cs="Noto Serif"/>
+          <w:sz w:val="24"/>
+          <w:szCs w:val="24"/>
+          <w:lang w:val="en-US"/>
+        </w:rPr>
+        <w:t>Yangqin</w:t>
+      </w:r>
+    </w:p>
+    <w:p>
+      <w:pPr>
+        <w:rPr>
+          <w:rFonts w:ascii="Noto Serif" w:eastAsia="Noto Serif SC" w:hAnsi="Noto Serif" w:cs="Noto Serif"/>
+          <w:sz w:val="24"/>
+          <w:szCs w:val="24"/>
+          <w:lang w:val="en-US"/>
+        </w:rPr>
+      </w:pPr>
+      <w:r>
+        <w:rPr>
+          <w:rFonts w:ascii="Noto Serif" w:eastAsia="Noto Serif SC" w:hAnsi="Noto Serif" w:cs="Noto Serif"/>
+          <w:sz w:val="24"/>
+          <w:szCs w:val="24"/>
+          <w:lang w:val="en-US"/>
+        </w:rPr>
+        <w:t xml:space="preserve">1 </w:t>
+      </w:r>
+      <w:r>
+        <w:rPr>
+          <w:rFonts w:ascii="Noto Serif" w:eastAsia="Noto Serif SC" w:hAnsi="Noto Serif" w:cs="Noto Serif"/>
+          <w:sz w:val="24"/>
+          <w:szCs w:val="24"/>
+          <w:lang w:val="en-US"/>
+        </w:rPr>
+        <w:t>琵琶</w:t>
       </w:r>
       <w:r>
         <w:rPr>
@@ -3385,17 +3312,52 @@
         </w:rPr>
         <w:t xml:space="preserve"> </w:t>
       </w:r>
-      <w:proofErr w:type="spellStart"/>
-      <w:r>
-        <w:rPr>
-          <w:rFonts w:ascii="Noto Serif" w:eastAsia="Noto Serif SC" w:hAnsi="Noto Serif" w:cs="Noto Serif"/>
-          <w:sz w:val="24"/>
-          <w:szCs w:val="24"/>
-          <w:lang w:val="en-US"/>
-        </w:rPr>
-        <w:t>Zhongyin</w:t>
-      </w:r>
-      <w:proofErr w:type="spellEnd"/>
+      <w:r>
+        <w:rPr>
+          <w:rFonts w:ascii="Noto Serif" w:eastAsia="Noto Serif SC" w:hAnsi="Noto Serif" w:cs="Noto Serif"/>
+          <w:sz w:val="24"/>
+          <w:szCs w:val="24"/>
+          <w:lang w:val="en-US"/>
+        </w:rPr>
+        <w:t xml:space="preserve">1 </w:t>
+      </w:r>
+      <w:r>
+        <w:rPr>
+          <w:rFonts w:ascii="Noto Serif" w:eastAsia="Noto Serif SC" w:hAnsi="Noto Serif" w:cs="Noto Serif"/>
+          <w:sz w:val="24"/>
+          <w:szCs w:val="24"/>
+          <w:lang w:val="en-US"/>
+        </w:rPr>
+        <w:t>Pipa</w:t>
+      </w:r>
+    </w:p>
+    <w:p>
+      <w:pPr>
+        <w:rPr>
+          <w:rFonts w:ascii="Noto Serif" w:eastAsia="Noto Serif SC" w:hAnsi="Noto Serif" w:cs="Noto Serif"/>
+          <w:sz w:val="24"/>
+          <w:szCs w:val="24"/>
+          <w:lang w:val="en-US"/>
+        </w:rPr>
+      </w:pPr>
+      <w:r>
+        <w:rPr>
+          <w:rFonts w:ascii="Noto Serif" w:eastAsia="Noto Serif SC" w:hAnsi="Noto Serif" w:cs="Noto Serif"/>
+          <w:sz w:val="24"/>
+          <w:szCs w:val="24"/>
+          <w:lang w:val="en-US"/>
+        </w:rPr>
+        <w:t xml:space="preserve">1 </w:t>
+      </w:r>
+      <w:r>
+        <w:rPr>
+          <w:rFonts w:ascii="Noto Serif" w:eastAsia="Noto Serif SC" w:hAnsi="Noto Serif" w:cs="Noto Serif"/>
+          <w:sz w:val="24"/>
+          <w:szCs w:val="24"/>
+          <w:lang w:val="en-US"/>
+        </w:rPr>
+        <w:t>中阮</w:t>
+      </w:r>
       <w:r>
         <w:rPr>
           <w:rFonts w:ascii="Noto Serif" w:eastAsia="Noto Serif SC" w:hAnsi="Noto Serif" w:cs="Noto Serif"/>
@@ -3405,121 +3367,43 @@
         </w:rPr>
         <w:t xml:space="preserve"> </w:t>
       </w:r>
-      <w:proofErr w:type="spellStart"/>
-      <w:r>
-        <w:rPr>
-          <w:rFonts w:ascii="Noto Serif" w:eastAsia="Noto Serif SC" w:hAnsi="Noto Serif" w:cs="Noto Serif"/>
-          <w:sz w:val="24"/>
-          <w:szCs w:val="24"/>
-          <w:lang w:val="en-US"/>
-        </w:rPr>
-        <w:t>Suona</w:t>
-      </w:r>
-      <w:proofErr w:type="spellEnd"/>
-    </w:p>
-    <w:p>
-      <w:pPr>
-        <w:rPr>
-          <w:rFonts w:ascii="Noto Serif" w:eastAsia="Noto Serif SC" w:hAnsi="Noto Serif" w:cs="Noto Serif"/>
-          <w:sz w:val="24"/>
-          <w:szCs w:val="24"/>
-          <w:lang w:val="en-US"/>
-        </w:rPr>
-      </w:pPr>
-    </w:p>
-    <w:p>
-      <w:pPr>
-        <w:rPr>
-          <w:rFonts w:ascii="Noto Serif" w:eastAsia="Noto Serif SC" w:hAnsi="Noto Serif" w:cs="Noto Serif"/>
-          <w:sz w:val="24"/>
-          <w:szCs w:val="24"/>
-          <w:lang w:val="en-US"/>
-        </w:rPr>
-      </w:pPr>
-      <w:r>
-        <w:rPr>
-          <w:rFonts w:ascii="Noto Serif" w:eastAsia="Noto Serif SC" w:hAnsi="Noto Serif" w:cs="Noto Serif"/>
-          <w:sz w:val="24"/>
-          <w:szCs w:val="24"/>
-          <w:lang w:val="en-US"/>
-        </w:rPr>
-        <w:t>扬琴</w:t>
-      </w:r>
-      <w:r>
-        <w:rPr>
-          <w:rFonts w:ascii="Noto Serif" w:eastAsia="Noto Serif SC" w:hAnsi="Noto Serif" w:cs="Noto Serif"/>
-          <w:sz w:val="24"/>
-          <w:szCs w:val="24"/>
-          <w:lang w:val="en-US"/>
-        </w:rPr>
-        <w:t xml:space="preserve"> Yangqin</w:t>
-      </w:r>
-    </w:p>
-    <w:p>
-      <w:pPr>
-        <w:rPr>
-          <w:rFonts w:ascii="Noto Serif" w:eastAsia="Noto Serif SC" w:hAnsi="Noto Serif" w:cs="Noto Serif"/>
-          <w:sz w:val="24"/>
-          <w:szCs w:val="24"/>
-          <w:lang w:val="en-US"/>
-        </w:rPr>
-      </w:pPr>
-      <w:r>
-        <w:rPr>
-          <w:rFonts w:ascii="Noto Serif" w:eastAsia="Noto Serif SC" w:hAnsi="Noto Serif" w:cs="Noto Serif"/>
-          <w:sz w:val="24"/>
-          <w:szCs w:val="24"/>
-          <w:lang w:val="en-US"/>
-        </w:rPr>
-        <w:t>琵琶</w:t>
-      </w:r>
-      <w:r>
-        <w:rPr>
-          <w:rFonts w:ascii="Noto Serif" w:eastAsia="Noto Serif SC" w:hAnsi="Noto Serif" w:cs="Noto Serif"/>
-          <w:sz w:val="24"/>
-          <w:szCs w:val="24"/>
-          <w:lang w:val="en-US"/>
-        </w:rPr>
-        <w:t xml:space="preserve"> Pipa</w:t>
-      </w:r>
-    </w:p>
-    <w:p>
-      <w:pPr>
-        <w:rPr>
-          <w:rFonts w:ascii="Noto Serif" w:eastAsia="Noto Serif SC" w:hAnsi="Noto Serif" w:cs="Noto Serif"/>
-          <w:sz w:val="24"/>
-          <w:szCs w:val="24"/>
-          <w:lang w:val="en-US"/>
-        </w:rPr>
-      </w:pPr>
-      <w:r>
-        <w:rPr>
-          <w:rFonts w:ascii="Noto Serif" w:eastAsia="Noto Serif SC" w:hAnsi="Noto Serif" w:cs="Noto Serif"/>
-          <w:sz w:val="24"/>
-          <w:szCs w:val="24"/>
-          <w:lang w:val="en-US"/>
-        </w:rPr>
-        <w:t>中阮</w:t>
-      </w:r>
-      <w:r>
-        <w:rPr>
-          <w:rFonts w:ascii="Noto Serif" w:eastAsia="Noto Serif SC" w:hAnsi="Noto Serif" w:cs="Noto Serif"/>
-          <w:sz w:val="24"/>
-          <w:szCs w:val="24"/>
-          <w:lang w:val="en-US"/>
-        </w:rPr>
-        <w:t xml:space="preserve"> Zhongruan</w:t>
-      </w:r>
-    </w:p>
-    <w:p>
-      <w:pPr>
-        <w:rPr>
-          <w:rFonts w:ascii="Noto Serif" w:eastAsia="Noto Serif SC" w:hAnsi="Noto Serif" w:cs="Noto Serif"/>
-          <w:sz w:val="24"/>
-          <w:szCs w:val="24"/>
-          <w:lang w:val="en-US"/>
-        </w:rPr>
-      </w:pPr>
+      <w:r>
+        <w:rPr>
+          <w:rFonts w:ascii="Noto Serif" w:eastAsia="Noto Serif SC" w:hAnsi="Noto Serif" w:cs="Noto Serif"/>
+          <w:sz w:val="24"/>
+          <w:szCs w:val="24"/>
+          <w:lang w:val="en-US"/>
+        </w:rPr>
+        <w:t xml:space="preserve">1 </w:t>
+      </w:r>
+      <w:r>
+        <w:rPr>
+          <w:rFonts w:ascii="Noto Serif" w:eastAsia="Noto Serif SC" w:hAnsi="Noto Serif" w:cs="Noto Serif"/>
+          <w:sz w:val="24"/>
+          <w:szCs w:val="24"/>
+          <w:lang w:val="en-US"/>
+        </w:rPr>
+        <w:t>Zhongruan</w:t>
+      </w:r>
+    </w:p>
+    <w:p>
+      <w:pPr>
+        <w:rPr>
+          <w:rFonts w:ascii="Noto Serif" w:eastAsia="Noto Serif SC" w:hAnsi="Noto Serif" w:cs="Noto Serif"/>
+          <w:sz w:val="24"/>
+          <w:szCs w:val="24"/>
+          <w:lang w:val="en-US"/>
+        </w:rPr>
+      </w:pPr>
+      <w:r>
+        <w:rPr>
+          <w:rFonts w:ascii="Noto Serif" w:eastAsia="Noto Serif SC" w:hAnsi="Noto Serif" w:cs="Noto Serif"/>
+          <w:sz w:val="24"/>
+          <w:szCs w:val="24"/>
+          <w:lang w:val="en-US"/>
+        </w:rPr>
+        <w:t xml:space="preserve">1 </w:t>
+      </w:r>
       <w:r>
         <w:rPr>
           <w:rFonts w:ascii="Noto Serif" w:eastAsia="Noto Serif SC" w:hAnsi="Noto Serif" w:cs="Noto Serif"/>
@@ -3536,7 +3420,25 @@
           <w:szCs w:val="24"/>
           <w:lang w:val="en-US"/>
         </w:rPr>
-        <w:t xml:space="preserve"> Daruan</w:t>
+        <w:t xml:space="preserve"> </w:t>
+      </w:r>
+      <w:r>
+        <w:rPr>
+          <w:rFonts w:ascii="Noto Serif" w:eastAsia="Noto Serif SC" w:hAnsi="Noto Serif" w:cs="Noto Serif"/>
+          <w:sz w:val="24"/>
+          <w:szCs w:val="24"/>
+          <w:lang w:val="en-US"/>
+        </w:rPr>
+        <w:t xml:space="preserve">1 </w:t>
+      </w:r>
+      <w:r>
+        <w:rPr>
+          <w:rFonts w:ascii="Noto Serif" w:eastAsia="Noto Serif SC" w:hAnsi="Noto Serif" w:cs="Noto Serif"/>
+          <w:sz w:val="24"/>
+          <w:szCs w:val="24"/>
+          <w:lang w:val="en-US"/>
+        </w:rPr>
+        <w:t>Daruan</w:t>
       </w:r>
     </w:p>
     <w:p>
@@ -3622,23 +3524,105 @@
         </w:rPr>
         <w:t>中国大鼓</w:t>
       </w:r>
-      <w:proofErr w:type="spellStart"/>
       <w:r>
         <w:rPr>
           <w:rFonts w:ascii="Noto Serif" w:eastAsia="Noto Serif SC" w:hAnsi="Noto Serif" w:cs="Noto Serif"/>
           <w:sz w:val="20"/>
           <w:szCs w:val="20"/>
         </w:rPr>
-        <w:t>Zhongguo</w:t>
-      </w:r>
-      <w:proofErr w:type="spellEnd"/>
-      <w:r>
+        <w:t xml:space="preserve">Zhongguo Dagu </w:t>
+      </w:r>
+    </w:p>
+    <w:p>
+      <w:pPr>
+        <w:ind w:left="720" w:hanging="436"/>
         <w:rPr>
           <w:rFonts w:ascii="Noto Serif" w:eastAsia="Noto Serif SC" w:hAnsi="Noto Serif" w:cs="Noto Serif"/>
           <w:sz w:val="20"/>
           <w:szCs w:val="20"/>
-        </w:rPr>
-        <w:t xml:space="preserve"> Dagu </w:t>
+          <w:lang w:val="en-US"/>
+        </w:rPr>
+      </w:pPr>
+      <w:r>
+        <w:rPr>
+          <w:rFonts w:ascii="Noto Serif" w:eastAsia="Noto Serif SC" w:hAnsi="Noto Serif" w:cs="Noto Serif"/>
+          <w:sz w:val="20"/>
+          <w:szCs w:val="20"/>
+          <w:lang w:val="en-US"/>
+        </w:rPr>
+        <w:t xml:space="preserve">II: </w:t>
+      </w:r>
+      <w:r>
+        <w:rPr>
+          <w:rFonts w:ascii="Noto Serif" w:eastAsia="Noto Serif SC" w:hAnsi="Noto Serif" w:cs="Noto Serif"/>
+          <w:sz w:val="20"/>
+          <w:szCs w:val="20"/>
+        </w:rPr>
+        <w:t>排鼓</w:t>
+      </w:r>
+      <w:r>
+        <w:rPr>
+          <w:rFonts w:ascii="Noto Serif" w:eastAsia="Noto Serif SC" w:hAnsi="Noto Serif" w:cs="Noto Serif"/>
+          <w:sz w:val="20"/>
+          <w:szCs w:val="20"/>
+        </w:rPr>
+        <w:t xml:space="preserve">Paigu </w:t>
+      </w:r>
+      <w:r>
+        <w:rPr>
+          <w:rFonts w:ascii="Noto Serif" w:eastAsia="Noto Serif SC" w:hAnsi="Noto Serif" w:cs="Noto Serif"/>
+          <w:sz w:val="20"/>
+          <w:szCs w:val="20"/>
+        </w:rPr>
+        <w:t xml:space="preserve">, </w:t>
+      </w:r>
+      <w:r>
+        <w:rPr>
+          <w:rFonts w:ascii="Noto Serif" w:eastAsia="Noto Serif SC" w:hAnsi="Noto Serif" w:cs="Noto Serif"/>
+          <w:sz w:val="20"/>
+          <w:szCs w:val="20"/>
+        </w:rPr>
+        <w:t>小钟琴</w:t>
+      </w:r>
+      <w:r>
+        <w:rPr>
+          <w:rFonts w:ascii="Noto Serif" w:eastAsia="Noto Serif SC" w:hAnsi="Noto Serif" w:cs="Noto Serif"/>
+          <w:sz w:val="20"/>
+          <w:szCs w:val="20"/>
+        </w:rPr>
+        <w:t xml:space="preserve"> Glockenspiel</w:t>
+      </w:r>
+      <w:r>
+        <w:rPr>
+          <w:rFonts w:ascii="Noto Serif" w:eastAsia="Noto Serif SC" w:hAnsi="Noto Serif" w:cs="Noto Serif"/>
+          <w:sz w:val="20"/>
+          <w:szCs w:val="20"/>
+        </w:rPr>
+        <w:t xml:space="preserve">, </w:t>
+      </w:r>
+      <w:r>
+        <w:rPr>
+          <w:rFonts w:ascii="Noto Serif" w:eastAsia="Noto Serif SC" w:hAnsi="Noto Serif" w:cs="Noto Serif"/>
+          <w:sz w:val="20"/>
+          <w:szCs w:val="20"/>
+        </w:rPr>
+        <w:t>大锣</w:t>
+      </w:r>
+      <w:r>
+        <w:rPr>
+          <w:rFonts w:ascii="Noto Serif" w:eastAsia="Noto Serif SC" w:hAnsi="Noto Serif" w:cs="Noto Serif"/>
+          <w:sz w:val="20"/>
+          <w:szCs w:val="20"/>
+        </w:rPr>
+        <w:t xml:space="preserve"> </w:t>
+      </w:r>
+      <w:r>
+        <w:rPr>
+          <w:rFonts w:ascii="Noto Serif" w:eastAsia="Noto Serif SC" w:hAnsi="Noto Serif" w:cs="Noto Serif"/>
+          <w:sz w:val="20"/>
+          <w:szCs w:val="20"/>
+        </w:rPr>
+        <w:t>Daluo</w:t>
       </w:r>
     </w:p>
     <w:p>
@@ -3648,7 +3632,6 @@
           <w:rFonts w:ascii="Noto Serif" w:eastAsia="Noto Serif SC" w:hAnsi="Noto Serif" w:cs="Noto Serif"/>
           <w:sz w:val="20"/>
           <w:szCs w:val="20"/>
-          <w:lang w:val="en-US"/>
         </w:rPr>
       </w:pPr>
       <w:r>
@@ -3658,7 +3641,7 @@
           <w:szCs w:val="20"/>
           <w:lang w:val="en-US"/>
         </w:rPr>
-        <w:t xml:space="preserve">II: </w:t>
+        <w:t xml:space="preserve">III: </w:t>
       </w:r>
       <w:r>
         <w:rPr>
@@ -3666,25 +3649,23 @@
           <w:sz w:val="20"/>
           <w:szCs w:val="20"/>
         </w:rPr>
-        <w:t>排鼓</w:t>
-      </w:r>
-      <w:proofErr w:type="spellStart"/>
+        <w:t>大锣</w:t>
+      </w:r>
       <w:r>
         <w:rPr>
           <w:rFonts w:ascii="Noto Serif" w:eastAsia="Noto Serif SC" w:hAnsi="Noto Serif" w:cs="Noto Serif"/>
           <w:sz w:val="20"/>
           <w:szCs w:val="20"/>
         </w:rPr>
-        <w:t>Paigu</w:t>
-      </w:r>
-      <w:proofErr w:type="spellEnd"/>
+        <w:t xml:space="preserve"> Daluo, </w:t>
+      </w:r>
       <w:r>
         <w:rPr>
           <w:rFonts w:ascii="Noto Serif" w:eastAsia="Noto Serif SC" w:hAnsi="Noto Serif" w:cs="Noto Serif"/>
           <w:sz w:val="20"/>
           <w:szCs w:val="20"/>
         </w:rPr>
-        <w:t xml:space="preserve"> </w:t>
+        <w:t>梆子</w:t>
       </w:r>
       <w:r>
         <w:rPr>
@@ -3692,144 +3673,7 @@
           <w:sz w:val="20"/>
           <w:szCs w:val="20"/>
         </w:rPr>
-        <w:t xml:space="preserve">, </w:t>
-      </w:r>
-      <w:r>
-        <w:rPr>
-          <w:rFonts w:ascii="Noto Serif" w:eastAsia="Noto Serif SC" w:hAnsi="Noto Serif" w:cs="Noto Serif"/>
-          <w:sz w:val="20"/>
-          <w:szCs w:val="20"/>
-        </w:rPr>
-        <w:t>小钟琴</w:t>
-      </w:r>
-      <w:r>
-        <w:rPr>
-          <w:rFonts w:ascii="Noto Serif" w:eastAsia="Noto Serif SC" w:hAnsi="Noto Serif" w:cs="Noto Serif"/>
-          <w:sz w:val="20"/>
-          <w:szCs w:val="20"/>
-        </w:rPr>
-        <w:t xml:space="preserve"> Glockenspiel</w:t>
-      </w:r>
-      <w:r>
-        <w:rPr>
-          <w:rFonts w:ascii="Noto Serif" w:eastAsia="Noto Serif SC" w:hAnsi="Noto Serif" w:cs="Noto Serif"/>
-          <w:sz w:val="20"/>
-          <w:szCs w:val="20"/>
-        </w:rPr>
-        <w:t xml:space="preserve">, </w:t>
-      </w:r>
-      <w:r>
-        <w:rPr>
-          <w:rFonts w:ascii="Noto Serif" w:eastAsia="Noto Serif SC" w:hAnsi="Noto Serif" w:cs="Noto Serif"/>
-          <w:sz w:val="20"/>
-          <w:szCs w:val="20"/>
-        </w:rPr>
-        <w:t>大锣</w:t>
-      </w:r>
-      <w:r>
-        <w:rPr>
-          <w:rFonts w:ascii="Noto Serif" w:eastAsia="Noto Serif SC" w:hAnsi="Noto Serif" w:cs="Noto Serif"/>
-          <w:sz w:val="20"/>
-          <w:szCs w:val="20"/>
-        </w:rPr>
-        <w:t xml:space="preserve"> </w:t>
-      </w:r>
-      <w:proofErr w:type="spellStart"/>
-      <w:r>
-        <w:rPr>
-          <w:rFonts w:ascii="Noto Serif" w:eastAsia="Noto Serif SC" w:hAnsi="Noto Serif" w:cs="Noto Serif"/>
-          <w:sz w:val="20"/>
-          <w:szCs w:val="20"/>
-        </w:rPr>
-        <w:t>Daluo</w:t>
-      </w:r>
-      <w:proofErr w:type="spellEnd"/>
-    </w:p>
-    <w:p>
-      <w:pPr>
-        <w:ind w:left="720" w:hanging="436"/>
-        <w:rPr>
-          <w:rFonts w:ascii="Noto Serif" w:eastAsia="Noto Serif SC" w:hAnsi="Noto Serif" w:cs="Noto Serif"/>
-          <w:sz w:val="20"/>
-          <w:szCs w:val="20"/>
-        </w:rPr>
-      </w:pPr>
-      <w:r>
-        <w:rPr>
-          <w:rFonts w:ascii="Noto Serif" w:eastAsia="Noto Serif SC" w:hAnsi="Noto Serif" w:cs="Noto Serif"/>
-          <w:sz w:val="20"/>
-          <w:szCs w:val="20"/>
-          <w:lang w:val="en-US"/>
-        </w:rPr>
-        <w:t xml:space="preserve">III: </w:t>
-      </w:r>
-      <w:r>
-        <w:rPr>
-          <w:rFonts w:ascii="Noto Serif" w:eastAsia="Noto Serif SC" w:hAnsi="Noto Serif" w:cs="Noto Serif"/>
-          <w:sz w:val="20"/>
-          <w:szCs w:val="20"/>
-        </w:rPr>
-        <w:t>大锣</w:t>
-      </w:r>
-      <w:r>
-        <w:rPr>
-          <w:rFonts w:ascii="Noto Serif" w:eastAsia="Noto Serif SC" w:hAnsi="Noto Serif" w:cs="Noto Serif"/>
-          <w:sz w:val="20"/>
-          <w:szCs w:val="20"/>
-        </w:rPr>
-        <w:t xml:space="preserve"> </w:t>
-      </w:r>
-      <w:proofErr w:type="spellStart"/>
-      <w:r>
-        <w:rPr>
-          <w:rFonts w:ascii="Noto Serif" w:eastAsia="Noto Serif SC" w:hAnsi="Noto Serif" w:cs="Noto Serif"/>
-          <w:sz w:val="20"/>
-          <w:szCs w:val="20"/>
-        </w:rPr>
-        <w:t>Daluo</w:t>
-      </w:r>
-      <w:proofErr w:type="spellEnd"/>
-      <w:r>
-        <w:rPr>
-          <w:rFonts w:ascii="Noto Serif" w:eastAsia="Noto Serif SC" w:hAnsi="Noto Serif" w:cs="Noto Serif"/>
-          <w:sz w:val="20"/>
-          <w:szCs w:val="20"/>
-        </w:rPr>
-        <w:t xml:space="preserve">, </w:t>
-      </w:r>
-      <w:r>
-        <w:rPr>
-          <w:rFonts w:ascii="Noto Serif" w:eastAsia="Noto Serif SC" w:hAnsi="Noto Serif" w:cs="Noto Serif"/>
-          <w:sz w:val="20"/>
-          <w:szCs w:val="20"/>
-        </w:rPr>
-        <w:t>梆子</w:t>
-      </w:r>
-      <w:r>
-        <w:rPr>
-          <w:rFonts w:ascii="Noto Serif" w:eastAsia="Noto Serif SC" w:hAnsi="Noto Serif" w:cs="Noto Serif"/>
-          <w:sz w:val="20"/>
-          <w:szCs w:val="20"/>
-        </w:rPr>
-        <w:t xml:space="preserve"> </w:t>
-      </w:r>
-      <w:proofErr w:type="spellStart"/>
-      <w:r>
-        <w:rPr>
-          <w:rFonts w:ascii="Noto Serif" w:eastAsia="Noto Serif SC" w:hAnsi="Noto Serif" w:cs="Noto Serif"/>
-          <w:sz w:val="20"/>
-          <w:szCs w:val="20"/>
-        </w:rPr>
-        <w:t>Bangzi</w:t>
-      </w:r>
-      <w:proofErr w:type="spellEnd"/>
-      <w:r>
-        <w:rPr>
-          <w:rFonts w:ascii="Noto Serif" w:eastAsia="Noto Serif SC" w:hAnsi="Noto Serif" w:cs="Noto Serif"/>
-          <w:sz w:val="20"/>
-          <w:szCs w:val="20"/>
-        </w:rPr>
-        <w:t xml:space="preserve">, </w:t>
+        <w:t xml:space="preserve"> Bangzi, </w:t>
       </w:r>
       <w:r>
         <w:rPr>
@@ -3932,179 +3776,170 @@
           <w:sz w:val="20"/>
           <w:szCs w:val="20"/>
         </w:rPr>
+        <w:t xml:space="preserve"> Xiaocha, </w:t>
+      </w:r>
+      <w:r>
+        <w:rPr>
+          <w:rFonts w:ascii="Noto Serif" w:eastAsia="Noto Serif SC" w:hAnsi="Noto Serif" w:cs="Noto Serif"/>
+          <w:sz w:val="20"/>
+          <w:szCs w:val="20"/>
+        </w:rPr>
+        <w:t>三角铁</w:t>
+      </w:r>
+      <w:r>
+        <w:rPr>
+          <w:rFonts w:ascii="Noto Serif" w:eastAsia="Noto Serif SC" w:hAnsi="Noto Serif" w:cs="Noto Serif"/>
+          <w:sz w:val="20"/>
+          <w:szCs w:val="20"/>
+        </w:rPr>
+        <w:t xml:space="preserve"> Triangle, </w:t>
+      </w:r>
+      <w:r>
+        <w:rPr>
+          <w:rFonts w:ascii="Noto Serif" w:eastAsia="Noto Serif SC" w:hAnsi="Noto Serif" w:cs="Noto Serif"/>
+          <w:sz w:val="20"/>
+          <w:szCs w:val="20"/>
+        </w:rPr>
+        <w:t>大钹</w:t>
+      </w:r>
+      <w:r>
+        <w:rPr>
+          <w:rFonts w:ascii="Noto Serif" w:eastAsia="Noto Serif SC" w:hAnsi="Noto Serif" w:cs="Noto Serif"/>
+          <w:sz w:val="20"/>
+          <w:szCs w:val="20"/>
+        </w:rPr>
+        <w:t xml:space="preserve"> Dabo</w:t>
+      </w:r>
+    </w:p>
+    <w:p>
+      <w:pPr>
+        <w:rPr>
+          <w:rFonts w:ascii="Noto Serif" w:eastAsia="Noto Serif SC" w:hAnsi="Noto Serif" w:cs="Noto Serif"/>
+          <w:sz w:val="24"/>
+          <w:szCs w:val="24"/>
+          <w:lang w:val="en-US"/>
+        </w:rPr>
+      </w:pPr>
+    </w:p>
+    <w:p>
+      <w:pPr>
+        <w:rPr>
+          <w:rFonts w:ascii="Noto Serif" w:eastAsia="Noto Serif SC" w:hAnsi="Noto Serif" w:cs="Noto Serif"/>
+          <w:sz w:val="24"/>
+          <w:szCs w:val="24"/>
+          <w:lang w:val="en-US"/>
+        </w:rPr>
+      </w:pPr>
+      <w:r>
+        <w:rPr>
+          <w:rFonts w:ascii="Noto Serif" w:eastAsia="Noto Serif SC" w:hAnsi="Noto Serif" w:cs="Noto Serif"/>
+          <w:sz w:val="24"/>
+          <w:szCs w:val="24"/>
+          <w:lang w:val="en-US"/>
+        </w:rPr>
+        <w:t>高胡</w:t>
+      </w:r>
+      <w:r>
+        <w:rPr>
+          <w:rFonts w:ascii="Noto Serif" w:eastAsia="Noto Serif SC" w:hAnsi="Noto Serif" w:cs="Noto Serif"/>
+          <w:sz w:val="24"/>
+          <w:szCs w:val="24"/>
+          <w:lang w:val="en-US"/>
+        </w:rPr>
+        <w:t xml:space="preserve"> Gaohu</w:t>
+      </w:r>
+    </w:p>
+    <w:p>
+      <w:pPr>
+        <w:rPr>
+          <w:rFonts w:ascii="Noto Serif" w:eastAsia="Noto Serif SC" w:hAnsi="Noto Serif" w:cs="Noto Serif"/>
+          <w:sz w:val="24"/>
+          <w:szCs w:val="24"/>
+          <w:lang w:val="en-US"/>
+        </w:rPr>
+      </w:pPr>
+      <w:r>
+        <w:rPr>
+          <w:rFonts w:ascii="Noto Serif" w:eastAsia="Noto Serif SC" w:hAnsi="Noto Serif" w:cs="Noto Serif"/>
+          <w:sz w:val="24"/>
+          <w:szCs w:val="24"/>
+          <w:lang w:val="en-US"/>
+        </w:rPr>
+        <w:t>二胡</w:t>
+      </w:r>
+      <w:r>
+        <w:rPr>
+          <w:rFonts w:ascii="Noto Serif" w:eastAsia="Noto Serif SC" w:hAnsi="Noto Serif" w:cs="Noto Serif"/>
+          <w:sz w:val="24"/>
+          <w:szCs w:val="24"/>
+          <w:lang w:val="en-US"/>
+        </w:rPr>
+        <w:t xml:space="preserve"> Erhu</w:t>
+      </w:r>
+    </w:p>
+    <w:p>
+      <w:pPr>
+        <w:rPr>
+          <w:rFonts w:ascii="Noto Serif" w:eastAsia="Noto Serif SC" w:hAnsi="Noto Serif" w:cs="Noto Serif"/>
+          <w:sz w:val="24"/>
+          <w:szCs w:val="24"/>
+          <w:lang w:val="en-US"/>
+        </w:rPr>
+      </w:pPr>
+      <w:r>
+        <w:rPr>
+          <w:rFonts w:ascii="Noto Serif" w:eastAsia="Noto Serif SC" w:hAnsi="Noto Serif" w:cs="Noto Serif"/>
+          <w:sz w:val="24"/>
+          <w:szCs w:val="24"/>
+          <w:lang w:val="en-US"/>
+        </w:rPr>
+        <w:t>中胡</w:t>
+      </w:r>
+      <w:r>
+        <w:rPr>
+          <w:rFonts w:ascii="Noto Serif" w:eastAsia="Noto Serif SC" w:hAnsi="Noto Serif" w:cs="Noto Serif"/>
+          <w:sz w:val="24"/>
+          <w:szCs w:val="24"/>
+          <w:lang w:val="en-US"/>
+        </w:rPr>
+        <w:t xml:space="preserve"> Zhonghu</w:t>
+      </w:r>
+    </w:p>
+    <w:p>
+      <w:pPr>
+        <w:rPr>
+          <w:rFonts w:ascii="Noto Serif" w:eastAsia="Noto Serif SC" w:hAnsi="Noto Serif" w:cs="Noto Serif"/>
+          <w:sz w:val="24"/>
+          <w:szCs w:val="24"/>
+          <w:lang w:val="en-US"/>
+        </w:rPr>
+      </w:pPr>
+      <w:r>
+        <w:rPr>
+          <w:rFonts w:ascii="Noto Serif" w:eastAsia="Noto Serif SC" w:hAnsi="Noto Serif" w:cs="Noto Serif"/>
+          <w:sz w:val="24"/>
+          <w:szCs w:val="24"/>
+          <w:lang w:val="en-US"/>
+        </w:rPr>
+        <w:t>大提琴</w:t>
+      </w:r>
+      <w:r>
+        <w:rPr>
+          <w:rFonts w:ascii="Noto Serif" w:eastAsia="Noto Serif SC" w:hAnsi="Noto Serif" w:cs="Noto Serif"/>
+          <w:sz w:val="24"/>
+          <w:szCs w:val="24"/>
+          <w:lang w:val="en-US"/>
+        </w:rPr>
         <w:t xml:space="preserve"> </w:t>
       </w:r>
-      <w:proofErr w:type="spellStart"/>
-      <w:r>
-        <w:rPr>
-          <w:rFonts w:ascii="Noto Serif" w:eastAsia="Noto Serif SC" w:hAnsi="Noto Serif" w:cs="Noto Serif"/>
-          <w:sz w:val="20"/>
-          <w:szCs w:val="20"/>
-        </w:rPr>
-        <w:t>Xiaocha</w:t>
-      </w:r>
-      <w:proofErr w:type="spellEnd"/>
-      <w:r>
-        <w:rPr>
-          <w:rFonts w:ascii="Noto Serif" w:eastAsia="Noto Serif SC" w:hAnsi="Noto Serif" w:cs="Noto Serif"/>
-          <w:sz w:val="20"/>
-          <w:szCs w:val="20"/>
-        </w:rPr>
-        <w:t xml:space="preserve">, </w:t>
-      </w:r>
-      <w:r>
-        <w:rPr>
-          <w:rFonts w:ascii="Noto Serif" w:eastAsia="Noto Serif SC" w:hAnsi="Noto Serif" w:cs="Noto Serif"/>
-          <w:sz w:val="20"/>
-          <w:szCs w:val="20"/>
-        </w:rPr>
-        <w:t>三角铁</w:t>
-      </w:r>
-      <w:r>
-        <w:rPr>
-          <w:rFonts w:ascii="Noto Serif" w:eastAsia="Noto Serif SC" w:hAnsi="Noto Serif" w:cs="Noto Serif"/>
-          <w:sz w:val="20"/>
-          <w:szCs w:val="20"/>
-        </w:rPr>
-        <w:t xml:space="preserve"> Triangle, </w:t>
-      </w:r>
-      <w:r>
-        <w:rPr>
-          <w:rFonts w:ascii="Noto Serif" w:eastAsia="Noto Serif SC" w:hAnsi="Noto Serif" w:cs="Noto Serif"/>
-          <w:sz w:val="20"/>
-          <w:szCs w:val="20"/>
-        </w:rPr>
-        <w:t>大钹</w:t>
-      </w:r>
-      <w:r>
-        <w:rPr>
-          <w:rFonts w:ascii="Noto Serif" w:eastAsia="Noto Serif SC" w:hAnsi="Noto Serif" w:cs="Noto Serif"/>
-          <w:sz w:val="20"/>
-          <w:szCs w:val="20"/>
-        </w:rPr>
-        <w:t xml:space="preserve"> Dabo</w:t>
-      </w:r>
-    </w:p>
-    <w:p>
-      <w:pPr>
-        <w:rPr>
-          <w:rFonts w:ascii="Noto Serif" w:eastAsia="Noto Serif SC" w:hAnsi="Noto Serif" w:cs="Noto Serif"/>
-          <w:sz w:val="24"/>
-          <w:szCs w:val="24"/>
-          <w:lang w:val="en-US"/>
-        </w:rPr>
-      </w:pPr>
-    </w:p>
-    <w:p>
-      <w:pPr>
-        <w:rPr>
-          <w:rFonts w:ascii="Noto Serif" w:eastAsia="Noto Serif SC" w:hAnsi="Noto Serif" w:cs="Noto Serif"/>
-          <w:sz w:val="24"/>
-          <w:szCs w:val="24"/>
-          <w:lang w:val="en-US"/>
-        </w:rPr>
-      </w:pPr>
-      <w:r>
-        <w:rPr>
-          <w:rFonts w:ascii="Noto Serif" w:eastAsia="Noto Serif SC" w:hAnsi="Noto Serif" w:cs="Noto Serif"/>
-          <w:sz w:val="24"/>
-          <w:szCs w:val="24"/>
-          <w:lang w:val="en-US"/>
-        </w:rPr>
-        <w:t>高胡</w:t>
-      </w:r>
-      <w:r>
-        <w:rPr>
-          <w:rFonts w:ascii="Noto Serif" w:eastAsia="Noto Serif SC" w:hAnsi="Noto Serif" w:cs="Noto Serif"/>
-          <w:sz w:val="24"/>
-          <w:szCs w:val="24"/>
-          <w:lang w:val="en-US"/>
-        </w:rPr>
-        <w:t xml:space="preserve"> Gaohu</w:t>
-      </w:r>
-    </w:p>
-    <w:p>
-      <w:pPr>
-        <w:rPr>
-          <w:rFonts w:ascii="Noto Serif" w:eastAsia="Noto Serif SC" w:hAnsi="Noto Serif" w:cs="Noto Serif"/>
-          <w:sz w:val="24"/>
-          <w:szCs w:val="24"/>
-          <w:lang w:val="en-US"/>
-        </w:rPr>
-      </w:pPr>
-      <w:r>
-        <w:rPr>
-          <w:rFonts w:ascii="Noto Serif" w:eastAsia="Noto Serif SC" w:hAnsi="Noto Serif" w:cs="Noto Serif"/>
-          <w:sz w:val="24"/>
-          <w:szCs w:val="24"/>
-          <w:lang w:val="en-US"/>
-        </w:rPr>
-        <w:t>二胡</w:t>
-      </w:r>
-      <w:r>
-        <w:rPr>
-          <w:rFonts w:ascii="Noto Serif" w:eastAsia="Noto Serif SC" w:hAnsi="Noto Serif" w:cs="Noto Serif"/>
-          <w:sz w:val="24"/>
-          <w:szCs w:val="24"/>
-          <w:lang w:val="en-US"/>
-        </w:rPr>
-        <w:t xml:space="preserve"> Erhu</w:t>
-      </w:r>
-    </w:p>
-    <w:p>
-      <w:pPr>
-        <w:rPr>
-          <w:rFonts w:ascii="Noto Serif" w:eastAsia="Noto Serif SC" w:hAnsi="Noto Serif" w:cs="Noto Serif"/>
-          <w:sz w:val="24"/>
-          <w:szCs w:val="24"/>
-          <w:lang w:val="en-US"/>
-        </w:rPr>
-      </w:pPr>
-      <w:r>
-        <w:rPr>
-          <w:rFonts w:ascii="Noto Serif" w:eastAsia="Noto Serif SC" w:hAnsi="Noto Serif" w:cs="Noto Serif"/>
-          <w:sz w:val="24"/>
-          <w:szCs w:val="24"/>
-          <w:lang w:val="en-US"/>
-        </w:rPr>
-        <w:t>中胡</w:t>
-      </w:r>
-      <w:r>
-        <w:rPr>
-          <w:rFonts w:ascii="Noto Serif" w:eastAsia="Noto Serif SC" w:hAnsi="Noto Serif" w:cs="Noto Serif"/>
-          <w:sz w:val="24"/>
-          <w:szCs w:val="24"/>
-          <w:lang w:val="en-US"/>
-        </w:rPr>
-        <w:t xml:space="preserve"> Zhonghu</w:t>
-      </w:r>
-    </w:p>
-    <w:p>
-      <w:pPr>
-        <w:rPr>
-          <w:rFonts w:ascii="Noto Serif" w:eastAsia="Noto Serif SC" w:hAnsi="Noto Serif" w:cs="Noto Serif"/>
-          <w:sz w:val="24"/>
-          <w:szCs w:val="24"/>
-          <w:lang w:val="en-US"/>
-        </w:rPr>
-      </w:pPr>
-      <w:r>
-        <w:rPr>
-          <w:rFonts w:ascii="Noto Serif" w:eastAsia="Noto Serif SC" w:hAnsi="Noto Serif" w:cs="Noto Serif"/>
-          <w:sz w:val="24"/>
-          <w:szCs w:val="24"/>
-          <w:lang w:val="en-US"/>
-        </w:rPr>
-        <w:t>大提琴</w:t>
-      </w:r>
-      <w:r>
-        <w:rPr>
-          <w:rFonts w:ascii="Noto Serif" w:eastAsia="Noto Serif SC" w:hAnsi="Noto Serif" w:cs="Noto Serif"/>
-          <w:sz w:val="24"/>
-          <w:szCs w:val="24"/>
-          <w:lang w:val="en-US"/>
-        </w:rPr>
-        <w:t xml:space="preserve"> Violoncello</w:t>
+      <w:r>
+        <w:rPr>
+          <w:rFonts w:ascii="Noto Serif" w:eastAsia="Noto Serif SC" w:hAnsi="Noto Serif" w:cs="Noto Serif"/>
+          <w:sz w:val="24"/>
+          <w:szCs w:val="24"/>
+          <w:lang w:val="en-US"/>
+        </w:rPr>
+        <w:t>Violoncello</w:t>
       </w:r>
     </w:p>
     <w:p>

</xml_diff>